<commit_message>
The landing page, the one-page project map, and the emails around them
docs/ is the GitHub Pages site: index.html (one card per program; a
program is added to its PROGRAMS list), project-map.html (phase one and
two, who does what, what comes later), copies of Grant Radar and the solo
Volunteers & Events, and every guide as PDF. scripts/build-site.mjs
gathers it. Every quick start and manual now starts at the landing page,
and the suite guides open with "Where to start". guides/EMAILS.md is
rewritten: an overview for the Executive Director, and three program
emails written to be forwarded.

Co-Authored-By: Claude Fable 5.1 <noreply@anthropic.com>
Claude-Session: https://claude.ai/code/session_01NQwyA57oAsCk3BA8fwH8DZ
</commit_message>
<xml_diff>
--- a/grant-radar/dist/Nami_Grant_Radar_User_Manual.docx
+++ b/grant-radar/dist/Nami_Grant_Radar_User_Manual.docx
@@ -75,7 +75,19 @@
         <w:spacing w:after="120"/>
       </w:pPr>
       <w:r>
-        <w:t xml:space="preserve">Open the Grant Radar link. The first time, a short tour points at each part of the screen. Use </w:t>
+        <w:t xml:space="preserve">Open the NAMI landing page and press </w:t>
+      </w:r>
+      <w:r>
+        <w:rPr>
+          <w:b/>
+          <w:bCs/>
+          <w:i w:val="false"/>
+          <w:iCs w:val="false"/>
+        </w:rPr>
+        <w:t xml:space="preserve">Open Grant Radar</w:t>
+      </w:r>
+      <w:r>
+        <w:t xml:space="preserve">. The first time, a short tour points at each part of the screen. Use </w:t>
       </w:r>
       <w:r>
         <w:rPr>

</xml_diff>